<commit_message>
fix(docs): restore readable Chinese seed documents
</commit_message>
<xml_diff>
--- a/src/main/resources/sales-kb-docs/sales-coaching-and-objection-handling.docx
+++ b/src/main/resources/sales-kb-docs/sales-coaching-and-objection-handling.docx
@@ -8,16 +8,20 @@
       </w:pPr>
       <w:r>
         <w:rPr>
+          <w:rFonts w:ascii="Microsoft YaHei" w:hAnsi="Microsoft YaHei" w:eastAsia="Microsoft YaHei"/>
           <w:b/>
           <w:color w:val="0B2545"/>
           <w:sz w:val="36"/>
         </w:rPr>
-        <w:t>???????????</w:t>
+        <w:t>销售辅导与异议处理手册</w:t>
       </w:r>
     </w:p>
     <w:p>
       <w:r>
-        <w:t>??????? Agent ???????????????????????????????????????????????</w:t>
+        <w:rPr>
+          <w:rFonts w:ascii="Microsoft YaHei" w:hAnsi="Microsoft YaHei" w:eastAsia="Microsoft YaHei"/>
+        </w:rPr>
+        <w:t>适用场景：销售 Agent 在回答销售代表、经理或运营人员问题时，用于补全发现式提问、机会诊断、异议处理和下一步行动建议。</w:t>
       </w:r>
     </w:p>
     <w:p>
@@ -25,7 +29,10 @@
         <w:pStyle w:val="Heading1"/>
       </w:pPr>
       <w:r>
-        <w:t>??????????</w:t>
+        <w:rPr>
+          <w:rFonts w:ascii="Microsoft YaHei" w:hAnsi="Microsoft YaHei" w:eastAsia="Microsoft YaHei"/>
+        </w:rPr>
+        <w:t>一、通话辅导评分框架</w:t>
       </w:r>
     </w:p>
     <w:p>
@@ -35,7 +42,10 @@
         <w:ind w:left="540" w:hanging="271"/>
       </w:pPr>
       <w:r>
-        <w:t>?? 60 ??????????????????????????????</w:t>
+        <w:rPr>
+          <w:rFonts w:ascii="Microsoft YaHei" w:hAnsi="Microsoft YaHei" w:eastAsia="Microsoft YaHei"/>
+        </w:rPr>
+        <w:t>开场 60 秒内确认客户角色、会议目标和可用时间，避免直接进入产品演示。</w:t>
       </w:r>
     </w:p>
     <w:p>
@@ -45,7 +55,10 @@
         <w:ind w:left="540" w:hanging="271"/>
       </w:pPr>
       <w:r>
-        <w:t>?????????????????????????????????????</w:t>
+        <w:rPr>
+          <w:rFonts w:ascii="Microsoft YaHei" w:hAnsi="Microsoft YaHei" w:eastAsia="Microsoft YaHei"/>
+        </w:rPr>
+        <w:t>发现阶段至少覆盖业务目标、当前流程、痛点成本、决策链、上线时间和预算边界。</w:t>
       </w:r>
     </w:p>
     <w:p>
@@ -55,7 +68,10 @@
         <w:ind w:left="540" w:hanging="271"/>
       </w:pPr>
       <w:r>
-        <w:t>??????????????????????????????????????</w:t>
+        <w:rPr>
+          <w:rFonts w:ascii="Microsoft YaHei" w:hAnsi="Microsoft YaHei" w:eastAsia="Microsoft YaHei"/>
+        </w:rPr>
+        <w:t>每个关键痛点都要追问量化影响，例如人时损耗、线索流失率、审批周期或收入缺口。</w:t>
       </w:r>
     </w:p>
     <w:p>
@@ -65,7 +81,10 @@
         <w:ind w:left="540" w:hanging="271"/>
       </w:pPr>
       <w:r>
-        <w:t>??????????????????????????????????</w:t>
+        <w:rPr>
+          <w:rFonts w:ascii="Microsoft YaHei" w:hAnsi="Microsoft YaHei" w:eastAsia="Microsoft YaHei"/>
+        </w:rPr>
+        <w:t>客户给出模糊回答时，销售应复述并用二选一问题收敛，而不是继续堆功能。</w:t>
       </w:r>
     </w:p>
     <w:p>
@@ -75,7 +94,10 @@
         <w:ind w:left="540" w:hanging="271"/>
       </w:pPr>
       <w:r>
-        <w:t>???????????????????????????????????</w:t>
+        <w:rPr>
+          <w:rFonts w:ascii="Microsoft YaHei" w:hAnsi="Microsoft YaHei" w:eastAsia="Microsoft YaHei"/>
+        </w:rPr>
+        <w:t>结尾必须获得明确下一步：参与人、材料、时间、验收标准和客户侧准备事项。</w:t>
       </w:r>
     </w:p>
     <w:p>
@@ -83,14 +105,17 @@
         <w:pStyle w:val="Heading1"/>
       </w:pPr>
       <w:r>
-        <w:t>????????</w:t>
+        <w:rPr>
+          <w:rFonts w:ascii="Microsoft YaHei" w:hAnsi="Microsoft YaHei" w:eastAsia="Microsoft YaHei"/>
+        </w:rPr>
+        <w:t>二、异议处理矩阵</w:t>
       </w:r>
     </w:p>
     <w:tbl>
       <w:tblPr>
         <w:tblW w:type="auto" w:w="0"/>
         <w:jc w:val="center"/>
-        <w:tblLayout w:type="fixed"/>
+        <w:tblLayout w:type="autofit"/>
         <w:tblLook w:firstColumn="1" w:firstRow="1" w:lastColumn="0" w:lastRow="0" w:noHBand="0" w:noVBand="1" w:val="04A0"/>
       </w:tblPr>
       <w:tblGrid>
@@ -102,61 +127,65 @@
       <w:tr>
         <w:tc>
           <w:tcPr>
-            <w:tcW w:type="dxa" w:w="1800"/>
+            <w:tcW w:type="dxa" w:w="2340"/>
+            <w:shd w:fill="E8EEF5"/>
             <w:vAlign w:val="center"/>
-            <w:shd w:fill="E8EEF5"/>
           </w:tcPr>
           <w:p>
             <w:r>
               <w:rPr>
+                <w:rFonts w:ascii="Microsoft YaHei" w:hAnsi="Microsoft YaHei" w:eastAsia="Microsoft YaHei"/>
                 <w:b/>
               </w:rPr>
-              <w:t>??</w:t>
+              <w:t>异议</w:t>
             </w:r>
           </w:p>
         </w:tc>
         <w:tc>
           <w:tcPr>
-            <w:tcW w:type="dxa" w:w="2520"/>
+            <w:tcW w:type="dxa" w:w="2340"/>
+            <w:shd w:fill="E8EEF5"/>
             <w:vAlign w:val="center"/>
-            <w:shd w:fill="E8EEF5"/>
           </w:tcPr>
           <w:p>
             <w:r>
               <w:rPr>
+                <w:rFonts w:ascii="Microsoft YaHei" w:hAnsi="Microsoft YaHei" w:eastAsia="Microsoft YaHei"/>
                 <w:b/>
               </w:rPr>
-              <w:t>???</w:t>
+              <w:t>先确认</w:t>
             </w:r>
           </w:p>
         </w:tc>
         <w:tc>
           <w:tcPr>
-            <w:tcW w:type="dxa" w:w="2520"/>
+            <w:tcW w:type="dxa" w:w="2340"/>
+            <w:shd w:fill="E8EEF5"/>
             <w:vAlign w:val="center"/>
-            <w:shd w:fill="E8EEF5"/>
           </w:tcPr>
           <w:p>
             <w:r>
               <w:rPr>
+                <w:rFonts w:ascii="Microsoft YaHei" w:hAnsi="Microsoft YaHei" w:eastAsia="Microsoft YaHei"/>
                 <w:b/>
               </w:rPr>
-              <w:t>???</w:t>
+              <w:t>再诊断</w:t>
             </w:r>
           </w:p>
         </w:tc>
         <w:tc>
           <w:tcPr>
-            <w:tcW w:type="dxa" w:w="2520"/>
+            <w:tcW w:type="dxa" w:w="2340"/>
+            <w:shd w:fill="E8EEF5"/>
             <w:vAlign w:val="center"/>
-            <w:shd w:fill="E8EEF5"/>
           </w:tcPr>
           <w:p>
             <w:r>
               <w:rPr>
+                <w:rFonts w:ascii="Microsoft YaHei" w:hAnsi="Microsoft YaHei" w:eastAsia="Microsoft YaHei"/>
                 <w:b/>
               </w:rPr>
-              <w:t>????</w:t>
+              <w:t>最后推进</w:t>
             </w:r>
           </w:p>
         </w:tc>
@@ -164,45 +193,57 @@
       <w:tr>
         <w:tc>
           <w:tcPr>
-            <w:tcW w:type="dxa" w:w="1800"/>
+            <w:tcW w:type="dxa" w:w="2340"/>
             <w:vAlign w:val="top"/>
           </w:tcPr>
           <w:p>
             <w:r>
-              <w:t>????</w:t>
+              <w:rPr>
+                <w:rFonts w:ascii="Microsoft YaHei" w:hAnsi="Microsoft YaHei" w:eastAsia="Microsoft YaHei"/>
+              </w:rPr>
+              <w:t>价格太高</w:t>
             </w:r>
           </w:p>
         </w:tc>
         <w:tc>
           <w:tcPr>
-            <w:tcW w:type="dxa" w:w="2520"/>
+            <w:tcW w:type="dxa" w:w="2340"/>
             <w:vAlign w:val="top"/>
           </w:tcPr>
           <w:p>
             <w:r>
-              <w:t>??????????????</w:t>
+              <w:rPr>
+                <w:rFonts w:ascii="Microsoft YaHei" w:hAnsi="Microsoft YaHei" w:eastAsia="Microsoft YaHei"/>
+              </w:rPr>
+              <w:t>确认客户比较对象和预算口径。</w:t>
             </w:r>
           </w:p>
         </w:tc>
         <w:tc>
           <w:tcPr>
-            <w:tcW w:type="dxa" w:w="2520"/>
+            <w:tcW w:type="dxa" w:w="2340"/>
             <w:vAlign w:val="top"/>
           </w:tcPr>
           <w:p>
             <w:r>
-              <w:t>???????????????????????</w:t>
+              <w:rPr>
+                <w:rFonts w:ascii="Microsoft YaHei" w:hAnsi="Microsoft YaHei" w:eastAsia="Microsoft YaHei"/>
+              </w:rPr>
+              <w:t>拆分一次性费用、实施成本、维护成本和机会成本。</w:t>
             </w:r>
           </w:p>
         </w:tc>
         <w:tc>
           <w:tcPr>
-            <w:tcW w:type="dxa" w:w="2520"/>
+            <w:tcW w:type="dxa" w:w="2340"/>
             <w:vAlign w:val="top"/>
           </w:tcPr>
           <w:p>
             <w:r>
-              <w:t>??????????????????????</w:t>
+              <w:rPr>
+                <w:rFonts w:ascii="Microsoft YaHei" w:hAnsi="Microsoft YaHei" w:eastAsia="Microsoft YaHei"/>
+              </w:rPr>
+              <w:t>用价值锚点给出试点范围、成功指标和复盘日期。</w:t>
             </w:r>
           </w:p>
         </w:tc>
@@ -210,45 +251,57 @@
       <w:tr>
         <w:tc>
           <w:tcPr>
-            <w:tcW w:type="dxa" w:w="1800"/>
+            <w:tcW w:type="dxa" w:w="2340"/>
             <w:vAlign w:val="top"/>
           </w:tcPr>
           <w:p>
             <w:r>
-              <w:t>????</w:t>
+              <w:rPr>
+                <w:rFonts w:ascii="Microsoft YaHei" w:hAnsi="Microsoft YaHei" w:eastAsia="Microsoft YaHei"/>
+              </w:rPr>
+              <w:t>暂时不急</w:t>
             </w:r>
           </w:p>
         </w:tc>
         <w:tc>
           <w:tcPr>
-            <w:tcW w:type="dxa" w:w="2520"/>
+            <w:tcW w:type="dxa" w:w="2340"/>
             <w:vAlign w:val="top"/>
           </w:tcPr>
           <w:p>
             <w:r>
-              <w:t>????????????????????</w:t>
+              <w:rPr>
+                <w:rFonts w:ascii="Microsoft YaHei" w:hAnsi="Microsoft YaHei" w:eastAsia="Microsoft YaHei"/>
+              </w:rPr>
+              <w:t>确认是没有优先级，还是缺少内部推动人。</w:t>
             </w:r>
           </w:p>
         </w:tc>
         <w:tc>
           <w:tcPr>
-            <w:tcW w:type="dxa" w:w="2520"/>
+            <w:tcW w:type="dxa" w:w="2340"/>
             <w:vAlign w:val="top"/>
           </w:tcPr>
           <w:p>
             <w:r>
-              <w:t>????????????????????</w:t>
+              <w:rPr>
+                <w:rFonts w:ascii="Microsoft YaHei" w:hAnsi="Microsoft YaHei" w:eastAsia="Microsoft YaHei"/>
+              </w:rPr>
+              <w:t>追问当前问题继续存在会影响哪个季度目标。</w:t>
             </w:r>
           </w:p>
         </w:tc>
         <w:tc>
           <w:tcPr>
-            <w:tcW w:type="dxa" w:w="2520"/>
+            <w:tcW w:type="dxa" w:w="2340"/>
             <w:vAlign w:val="top"/>
           </w:tcPr>
           <w:p>
             <w:r>
-              <w:t>?????????????????????</w:t>
+              <w:rPr>
+                <w:rFonts w:ascii="Microsoft YaHei" w:hAnsi="Microsoft YaHei" w:eastAsia="Microsoft YaHei"/>
+              </w:rPr>
+              <w:t>建议低风险试点或业务评估会，降低启动门槛。</w:t>
             </w:r>
           </w:p>
         </w:tc>
@@ -256,45 +309,57 @@
       <w:tr>
         <w:tc>
           <w:tcPr>
-            <w:tcW w:type="dxa" w:w="1800"/>
+            <w:tcW w:type="dxa" w:w="2340"/>
             <w:vAlign w:val="top"/>
           </w:tcPr>
           <w:p>
             <w:r>
-              <w:t>?????</w:t>
+              <w:rPr>
+                <w:rFonts w:ascii="Microsoft YaHei" w:hAnsi="Microsoft YaHei" w:eastAsia="Microsoft YaHei"/>
+              </w:rPr>
+              <w:t>已有供应商</w:t>
             </w:r>
           </w:p>
         </w:tc>
         <w:tc>
           <w:tcPr>
-            <w:tcW w:type="dxa" w:w="2520"/>
+            <w:tcW w:type="dxa" w:w="2340"/>
             <w:vAlign w:val="top"/>
           </w:tcPr>
           <w:p>
             <w:r>
-              <w:t>????????????????</w:t>
+              <w:rPr>
+                <w:rFonts w:ascii="Microsoft YaHei" w:hAnsi="Microsoft YaHei" w:eastAsia="Microsoft YaHei"/>
+              </w:rPr>
+              <w:t>认可已有投入，避免否定客户选择。</w:t>
             </w:r>
           </w:p>
         </w:tc>
         <w:tc>
           <w:tcPr>
-            <w:tcW w:type="dxa" w:w="2520"/>
+            <w:tcW w:type="dxa" w:w="2340"/>
             <w:vAlign w:val="top"/>
           </w:tcPr>
           <w:p>
             <w:r>
-              <w:t>??????????????????</w:t>
+              <w:rPr>
+                <w:rFonts w:ascii="Microsoft YaHei" w:hAnsi="Microsoft YaHei" w:eastAsia="Microsoft YaHei"/>
+              </w:rPr>
+              <w:t>询问现供应商在哪些流程仍需人工补位。</w:t>
             </w:r>
           </w:p>
         </w:tc>
         <w:tc>
           <w:tcPr>
-            <w:tcW w:type="dxa" w:w="2520"/>
+            <w:tcW w:type="dxa" w:w="2340"/>
             <w:vAlign w:val="top"/>
           </w:tcPr>
           <w:p>
             <w:r>
-              <w:t>?????????????????????</w:t>
+              <w:rPr>
+                <w:rFonts w:ascii="Microsoft YaHei" w:hAnsi="Microsoft YaHei" w:eastAsia="Microsoft YaHei"/>
+              </w:rPr>
+              <w:t>定位互补场景，先争取小范围替换或并行评估。</w:t>
             </w:r>
           </w:p>
         </w:tc>
@@ -302,45 +367,57 @@
       <w:tr>
         <w:tc>
           <w:tcPr>
-            <w:tcW w:type="dxa" w:w="1800"/>
+            <w:tcW w:type="dxa" w:w="2340"/>
             <w:vAlign w:val="top"/>
           </w:tcPr>
           <w:p>
             <w:r>
-              <w:t>??????</w:t>
+              <w:rPr>
+                <w:rFonts w:ascii="Microsoft YaHei" w:hAnsi="Microsoft YaHei" w:eastAsia="Microsoft YaHei"/>
+              </w:rPr>
+              <w:t>需要领导同意</w:t>
             </w:r>
           </w:p>
         </w:tc>
         <w:tc>
           <w:tcPr>
-            <w:tcW w:type="dxa" w:w="2520"/>
+            <w:tcW w:type="dxa" w:w="2340"/>
             <w:vAlign w:val="top"/>
           </w:tcPr>
           <w:p>
             <w:r>
-              <w:t>??????????????????</w:t>
+              <w:rPr>
+                <w:rFonts w:ascii="Microsoft YaHei" w:hAnsi="Microsoft YaHei" w:eastAsia="Microsoft YaHei"/>
+              </w:rPr>
+              <w:t>确认领导关心成本、风险还是战略匹配。</w:t>
             </w:r>
           </w:p>
         </w:tc>
         <w:tc>
           <w:tcPr>
-            <w:tcW w:type="dxa" w:w="2520"/>
+            <w:tcW w:type="dxa" w:w="2340"/>
             <w:vAlign w:val="top"/>
           </w:tcPr>
           <w:p>
             <w:r>
-              <w:t>???????ROI??????????????</w:t>
+              <w:rPr>
+                <w:rFonts w:ascii="Microsoft YaHei" w:hAnsi="Microsoft YaHei" w:eastAsia="Microsoft YaHei"/>
+              </w:rPr>
+              <w:t>补齐决策材料：ROI、风险、上线计划和竞品对比。</w:t>
             </w:r>
           </w:p>
         </w:tc>
         <w:tc>
           <w:tcPr>
-            <w:tcW w:type="dxa" w:w="2520"/>
+            <w:tcW w:type="dxa" w:w="2340"/>
             <w:vAlign w:val="top"/>
           </w:tcPr>
           <w:p>
             <w:r>
-              <w:t>???????????????????????</w:t>
+              <w:rPr>
+                <w:rFonts w:ascii="Microsoft YaHei" w:hAnsi="Microsoft YaHei" w:eastAsia="Microsoft YaHei"/>
+              </w:rPr>
+              <w:t>请求共同准备管理层汇报，而不是只等客户转述。</w:t>
             </w:r>
           </w:p>
         </w:tc>
@@ -351,7 +428,10 @@
         <w:pStyle w:val="Heading1"/>
       </w:pPr>
       <w:r>
-        <w:t>??Agent ????</w:t>
+        <w:rPr>
+          <w:rFonts w:ascii="Microsoft YaHei" w:hAnsi="Microsoft YaHei" w:eastAsia="Microsoft YaHei"/>
+        </w:rPr>
+        <w:t>三、Agent 回答规则</w:t>
       </w:r>
     </w:p>
     <w:p>
@@ -361,7 +441,10 @@
         <w:ind w:left="540" w:hanging="271"/>
       </w:pPr>
       <w:r>
-        <w:t>??????????????????? CRM ???????????????????????????????????</w:t>
+        <w:rPr>
+          <w:rFonts w:ascii="Microsoft YaHei" w:hAnsi="Microsoft YaHei" w:eastAsia="Microsoft YaHei"/>
+        </w:rPr>
+        <w:t>当用户询问“为什么客户不推进”时，先从 CRM 阶段、最后活动时间、下一步是否明确、金额变化和负责人变更五个维度诊断。</w:t>
       </w:r>
     </w:p>
     <w:p>
@@ -371,7 +454,10 @@
         <w:ind w:left="540" w:hanging="271"/>
       </w:pPr>
       <w:r>
-        <w:t>???????????????????????????????????????????????????</w:t>
+        <w:rPr>
+          <w:rFonts w:ascii="Microsoft YaHei" w:hAnsi="Microsoft YaHei" w:eastAsia="Microsoft YaHei"/>
+        </w:rPr>
+        <w:t>当用户询问“怎么说服客户”时，回答必须同时包含客户视角收益、风险降低动作、下一次会议目标和可复制话术。</w:t>
       </w:r>
     </w:p>
     <w:p>
@@ -381,7 +467,70 @@
         <w:ind w:left="540" w:hanging="271"/>
       </w:pPr>
       <w:r>
-        <w:t>?????????????????????????????????????????????????????</w:t>
+        <w:rPr>
+          <w:rFonts w:ascii="Microsoft YaHei" w:hAnsi="Microsoft YaHei" w:eastAsia="Microsoft YaHei"/>
+        </w:rPr>
+        <w:t>当命中知识库内容但缺少销售数据时，应明确说明“基于方法论建议”，不要伪造客户、金额或订单。</w:t>
+      </w:r>
+    </w:p>
+    <w:p>
+      <w:pPr>
+        <w:pStyle w:val="Heading1"/>
+      </w:pPr>
+      <w:r>
+        <w:rPr>
+          <w:rFonts w:ascii="Microsoft YaHei" w:hAnsi="Microsoft YaHei" w:eastAsia="Microsoft YaHei"/>
+        </w:rPr>
+        <w:t>四、示例话术</w:t>
+      </w:r>
+    </w:p>
+    <w:p>
+      <w:pPr>
+        <w:pStyle w:val="Heading2"/>
+      </w:pPr>
+      <w:r>
+        <w:rPr>
+          <w:rFonts w:ascii="Microsoft YaHei" w:hAnsi="Microsoft YaHei" w:eastAsia="Microsoft YaHei"/>
+        </w:rPr>
+        <w:t>价格异议</w:t>
+      </w:r>
+    </w:p>
+    <w:p>
+      <w:r>
+        <w:rPr>
+          <w:rFonts w:ascii="Microsoft YaHei" w:hAnsi="Microsoft YaHei" w:eastAsia="Microsoft YaHei"/>
+        </w:rPr>
+        <w:t>“我理解预算压力。为了判断是否真的贵，我们先把比较口径对齐：您现在是在比较许可证价格，还是比较上线后节省的人力、减少的漏单和更快回款带来的收益？”</w:t>
+      </w:r>
+    </w:p>
+    <w:p>
+      <w:pPr>
+        <w:pStyle w:val="Heading2"/>
+      </w:pPr>
+      <w:r>
+        <w:rPr>
+          <w:rFonts w:ascii="Microsoft YaHei" w:hAnsi="Microsoft YaHei" w:eastAsia="Microsoft YaHei"/>
+        </w:rPr>
+        <w:t>推进停滞</w:t>
+      </w:r>
+    </w:p>
+    <w:p>
+      <w:r>
+        <w:rPr>
+          <w:rFonts w:ascii="Microsoft YaHei" w:hAnsi="Microsoft YaHei" w:eastAsia="Microsoft YaHei"/>
+        </w:rPr>
+        <w:t>“如果这件事本季度不处理，最直接影响的是线索响应、销售预测还是客户续约？我们可以先用一个两周试点验证最关键的指标。”</w:t>
+      </w:r>
+    </w:p>
+    <w:p>
+      <w:pPr>
+        <w:pStyle w:val="Heading1"/>
+      </w:pPr>
+      <w:r>
+        <w:rPr>
+          <w:rFonts w:ascii="Microsoft YaHei" w:hAnsi="Microsoft YaHei" w:eastAsia="Microsoft YaHei"/>
+        </w:rPr>
+        <w:t>五、参考来源</w:t>
       </w:r>
     </w:p>
     <w:p>
@@ -391,62 +540,10 @@
         <w:ind w:left="540" w:hanging="271"/>
       </w:pPr>
       <w:r>
-        <w:t>?????????????????????????????????????????????</w:t>
-      </w:r>
-    </w:p>
-    <w:p>
-      <w:pPr>
-        <w:pStyle w:val="Heading1"/>
-      </w:pPr>
-      <w:r>
-        <w:t>??????</w:t>
-      </w:r>
-    </w:p>
-    <w:p>
-      <w:pPr>
-        <w:pStyle w:val="Heading2"/>
-      </w:pPr>
-      <w:r>
-        <w:t>????</w:t>
-      </w:r>
-    </w:p>
-    <w:p>
-      <w:r>
-        <w:t>?????????????????????????????????????????????????????????????????????????</w:t>
-      </w:r>
-    </w:p>
-    <w:p>
-      <w:pPr>
-        <w:pStyle w:val="Heading2"/>
-      </w:pPr>
-      <w:r>
-        <w:t>????</w:t>
-      </w:r>
-    </w:p>
-    <w:p>
-      <w:r>
-        <w:t>??????????????????????????????????????????????????????????</w:t>
-      </w:r>
-    </w:p>
-    <w:p>
-      <w:pPr>
-        <w:pStyle w:val="Heading2"/>
-      </w:pPr>
-      <w:r>
-        <w:t>????</w:t>
-      </w:r>
-    </w:p>
-    <w:p>
-      <w:r>
-        <w:t>???????????????????????????????????????????????????</w:t>
-      </w:r>
-    </w:p>
-    <w:p>
-      <w:pPr>
-        <w:pStyle w:val="Heading1"/>
-      </w:pPr>
-      <w:r>
-        <w:t>??????</w:t>
+        <w:rPr>
+          <w:rFonts w:ascii="Microsoft YaHei" w:hAnsi="Microsoft YaHei" w:eastAsia="Microsoft YaHei"/>
+        </w:rPr>
+        <w:t>Salesforce 对销售流程、销售周期和管道阶段的公开说明。</w:t>
       </w:r>
     </w:p>
     <w:p>
@@ -456,7 +553,10 @@
         <w:ind w:left="540" w:hanging="271"/>
       </w:pPr>
       <w:r>
-        <w:t>Salesforce ?????????????????????</w:t>
+        <w:rPr>
+          <w:rFonts w:ascii="Microsoft YaHei" w:hAnsi="Microsoft YaHei" w:eastAsia="Microsoft YaHei"/>
+        </w:rPr>
+        <w:t>HubSpot 对销售管道和销售分析报表的公开产品文档。</w:t>
       </w:r>
     </w:p>
     <w:p>
@@ -466,17 +566,10 @@
         <w:ind w:left="540" w:hanging="271"/>
       </w:pPr>
       <w:r>
-        <w:t>HubSpot ????????????????????</w:t>
-      </w:r>
-    </w:p>
-    <w:p>
-      <w:pPr>
-        <w:pStyle w:val="ListBullet"/>
-        <w:spacing w:after="80" w:line="300" w:lineRule="auto"/>
-        <w:ind w:left="540" w:hanging="271"/>
-      </w:pPr>
-      <w:r>
-        <w:t>Gong ? discovery call?sales qualification ? call coaching checklist ?????????</w:t>
+        <w:rPr>
+          <w:rFonts w:ascii="Microsoft YaHei" w:hAnsi="Microsoft YaHei" w:eastAsia="Microsoft YaHei"/>
+        </w:rPr>
+        <w:t>Gong 对 discovery call、sales qualification 和 call coaching checklist 的公开方法论文章。</w:t>
       </w:r>
     </w:p>
     <w:sectPr>
@@ -856,8 +949,8 @@
       <w:spacing w:after="120" w:line="300" w:lineRule="auto"/>
     </w:pPr>
     <w:rPr>
-      <w:rFonts w:ascii="Calibri" w:hAnsi="Calibri"/>
-      <w:sz w:val="22"/>
+      <w:rFonts w:ascii="Microsoft YaHei" w:hAnsi="Microsoft YaHei" w:eastAsia="Microsoft YaHei"/>
+      <w:sz w:val="21"/>
     </w:rPr>
   </w:style>
   <w:style w:type="paragraph" w:styleId="Header">
@@ -915,11 +1008,11 @@
     <w:pPr>
       <w:keepNext/>
       <w:keepLines/>
-      <w:spacing w:before="360" w:after="200" w:line="300" w:lineRule="auto"/>
+      <w:spacing w:before="200" w:after="120" w:line="300" w:lineRule="auto"/>
       <w:outlineLvl w:val="0"/>
     </w:pPr>
     <w:rPr>
-      <w:rFonts w:asciiTheme="majorHAnsi" w:eastAsiaTheme="majorEastAsia" w:hAnsiTheme="majorHAnsi" w:cstheme="majorBidi" w:ascii="Calibri" w:hAnsi="Calibri"/>
+      <w:rFonts w:asciiTheme="majorHAnsi" w:eastAsiaTheme="majorEastAsia" w:hAnsiTheme="majorHAnsi" w:cstheme="majorBidi" w:ascii="Microsoft YaHei" w:hAnsi="Microsoft YaHei" w:eastAsia="Microsoft YaHei"/>
       <w:b/>
       <w:bCs/>
       <w:color w:val="2E74B5"/>
@@ -939,11 +1032,11 @@
     <w:pPr>
       <w:keepNext/>
       <w:keepLines/>
-      <w:spacing w:before="280" w:after="140" w:line="300" w:lineRule="auto"/>
+      <w:spacing w:before="200" w:after="120" w:line="300" w:lineRule="auto"/>
       <w:outlineLvl w:val="1"/>
     </w:pPr>
     <w:rPr>
-      <w:rFonts w:asciiTheme="majorHAnsi" w:eastAsiaTheme="majorEastAsia" w:hAnsiTheme="majorHAnsi" w:cstheme="majorBidi" w:ascii="Calibri" w:hAnsi="Calibri"/>
+      <w:rFonts w:asciiTheme="majorHAnsi" w:eastAsiaTheme="majorEastAsia" w:hAnsiTheme="majorHAnsi" w:cstheme="majorBidi" w:ascii="Microsoft YaHei" w:hAnsi="Microsoft YaHei" w:eastAsia="Microsoft YaHei"/>
       <w:b/>
       <w:bCs/>
       <w:color w:val="2E74B5"/>
@@ -963,11 +1056,11 @@
     <w:pPr>
       <w:keepNext/>
       <w:keepLines/>
-      <w:spacing w:before="200" w:after="100" w:line="300" w:lineRule="auto"/>
+      <w:spacing w:before="200" w:after="120" w:line="300" w:lineRule="auto"/>
       <w:outlineLvl w:val="2"/>
     </w:pPr>
     <w:rPr>
-      <w:rFonts w:asciiTheme="majorHAnsi" w:eastAsiaTheme="majorEastAsia" w:hAnsiTheme="majorHAnsi" w:cstheme="majorBidi" w:ascii="Calibri" w:hAnsi="Calibri"/>
+      <w:rFonts w:asciiTheme="majorHAnsi" w:eastAsiaTheme="majorEastAsia" w:hAnsiTheme="majorHAnsi" w:cstheme="majorBidi" w:ascii="Microsoft YaHei" w:hAnsi="Microsoft YaHei" w:eastAsia="Microsoft YaHei"/>
       <w:b/>
       <w:bCs/>
       <w:color w:val="1F4D78"/>

</xml_diff>